<commit_message>
docs(dao): mise à jour des livrables après développement des modules DAO
Analyse de conformité + canevas d'offre technique actualisés : les écarts
identifiés (interface SAGE, classification 4 niveaux, signature électronique,
SSO/AD + SIEM, organigramme, disciplinaire, offboarding, climat social,
talents avancés) sont désormais marqués LIVRÉS (développés, testés, intégrés).
- Verdict, estimation de note (~85-90/100) et plan d'écarts réactualisés.
- Matrice de conformité : statuts NON/PARTIEL → OUI pour les modules livrés.
- .gitattributes : PDF/DOCX traités en binaire (pas de normalisation CRLF).
</commit_message>
<xml_diff>
--- a/nexusrh_ci/docs/DAO/Canevas-Offre-Technique-NexusRH-CI.docx
+++ b/nexusrh_ci/docs/DAO/Canevas-Offre-Technique-NexusRH-CI.docx
@@ -1465,7 +1465,7 @@
           <w:color w:val="1A1A1A"/>
           <w:sz w:val="21"/>
         </w:rPr>
-        <w:t>Standard : ATS avec scoring IA, vivier, pipeline, page publique, pre-onboarding/checklists. Specifique (lot) : workflow de validation des besoins (Manager &gt; DRH/Finance &gt; DG), bibliotheque video et videos journalieres, bilan de fin d'integration, module offboarding + solde de tout compte.</w:t>
+        <w:t>Standard : ATS avec scoring IA, vivier, pipeline, page publique, pre-onboarding/checklists. Livre : module offboarding complet (motifs de depart, checklist de restitution, solde de tout compte conforme au Code du travail CI). Specifique (lot) : workflow de validation des besoins (Manager &gt; DRH/Finance &gt; DG), bibliotheque video et videos journalieres, bilan de fin d'integration.</w:t>
       </w:r>
     </w:p>
     <w:p>
@@ -1496,7 +1496,7 @@
           <w:color w:val="1A1A1A"/>
           <w:sz w:val="21"/>
         </w:rPr>
-        <w:t>Standard : dossier complet (etat civil, CNPS/NNI, contrats OHADA), historique des mouvements. Specifique : generateur multi-modeles de documents + signature electronique, gestion disciplinaire (niveau 4), suivi des visites medicales/aptitudes, coffre documentaire.</w:t>
+        <w:t>Standard : dossier complet (etat civil, CNPS/NNI, contrats OHADA), historique des mouvements. Livre : signature electronique integree (circuit de signataires sequentiel/parallele + piste d'audit), gestion disciplinaire (sanctions niveau 4, acces restreint). Specifique : generateur multi-modeles de documents, suivi des visites medicales/aptitudes, coffre documentaire.</w:t>
       </w:r>
     </w:p>
     <w:p>
@@ -1558,7 +1558,7 @@
           <w:color w:val="1A1A1A"/>
           <w:sz w:val="21"/>
         </w:rPr>
-        <w:t>NexusRH CI embarque un moteur de paie CI complet : laisser la paie a SAGE est OPTIONNEL. Option A - Paie native NexusRH : le moteur integre calcule la paie (CNPS double plafond, ITS/DGI, bulletins, declarations CNPS + DISA) ; SAGE devient facultatif. Option B - Interface SAGE (amont-paie) : SAGE garde le calcul, le SIRH collecte/controle/valide les variables et archive les bulletins. Specifique (lot 1, uniquement si Option B) : connecteur SAGE bidirectionnel (API/fichiers/SFTP) + coffre-fort des bulletins. Presenter les deux scenarios avec leurs impacts cout/delai/risque.</w:t>
+        <w:t>NexusRH CI embarque un moteur de paie CI complet : laisser la paie a SAGE est OPTIONNEL. Option A - Paie native NexusRH : le moteur integre calcule la paie (CNPS double plafond, ITS/DGI, bulletins, declarations CNPS + DISA) ; SAGE devient facultatif. Option B - Interface SAGE (amont-paie) : SAGE garde le calcul, le SIRH collecte/controle/valide les variables et archive les bulletins. Livre (si Option B) : module SAGE - export amont SIRH-&gt;SAGE des employes, elements variables et resultats de paie au format delimite parametrable (separateur, en-tete, matricule), UTF-8 BOM, neutralisation des injections CSV. Specifique restant : sens retour SAGE-&gt;SIRH (bulletins) + coffre-fort. Presenter les deux scenarios avec leurs impacts cout/delai/risque.</w:t>
       </w:r>
     </w:p>
     <w:p>
@@ -1589,7 +1589,7 @@
           <w:color w:val="1A1A1A"/>
           <w:sz w:val="21"/>
         </w:rPr>
-        <w:t>Standard : matrice 9-box. Specifique : referentiel postes/competences (taxonomie de Bloom), campagnes d'evaluation + objectifs + validation N+2 + signature, calibrage, mobilites, successions/pools.</w:t>
+        <w:t>Standard : matrice 9-box. Livre : referentiel postes/competences sur la taxonomie de Bloom (1-6) + comparateur de postes, calibrage (sessions 9-box avant/apres + recommandations), mobilites (passerelles + gap analysis + decision DRH), successions (postes cles, viviers, readiness). Specifique restant : campagnes d'evaluation + objectifs + validation N+2.</w:t>
       </w:r>
     </w:p>
     <w:p>
@@ -1651,7 +1651,7 @@
           <w:color w:val="1A1A1A"/>
           <w:sz w:val="21"/>
         </w:rPr>
-        <w:t>Standard : reporting/dashboards (effectifs, turnover, absenteisme, masse salariale en FCFA), portail self-service mobile/PWA. Specifique : organigramme dynamique + export PDF/image, export generique Excel/CSV, enquetes climat social.</w:t>
+        <w:t>Standard : reporting/dashboards (effectifs, turnover, absenteisme, masse salariale en FCFA), portail self-service mobile/PWA. Livre : organigramme dynamique pyramidal (couleurs par niveau) + export PDF/SVG, enquetes climat social (resultats anonymises). Specifique restant : export generique Excel/CSV.</w:t>
       </w:r>
     </w:p>
     <w:tbl>
@@ -3005,7 +3005,7 @@
                 <w:color w:val="1A1A1A"/>
                 <w:sz w:val="19"/>
               </w:rPr>
-              <w:t>audit_log (qui/quoi/quand, avant/apres, IP) ; export SIEM a ajouter</w:t>
+              <w:t>audit_log (qui/quoi/quand, avant/apres, IP) + export SIEM livre (webhook HMAC, JSON/CEF)</w:t>
             </w:r>
           </w:p>
         </w:tc>
@@ -3028,7 +3028,7 @@
                 <w:color w:val="1A1A1A"/>
                 <w:sz w:val="19"/>
               </w:rPr>
-              <w:t>A completer (SIEM)</w:t>
+              <w:t>En place</w:t>
             </w:r>
           </w:p>
         </w:tc>
@@ -3141,7 +3141,7 @@
           <w:color w:val="1A1A1A"/>
           <w:sz w:val="21"/>
         </w:rPr>
-        <w:t>Decrire le modele de droits : RBAC (roles) + perimetre (entite/agence) + relation manageriale (N+1/N+2) + regles exceptionnelles (interim, delegation). Aligner sur les 6 profils du DAO et engager le developpement du role Administrateur Systeme (acces technique, masquage des salaires) et de la classification native a 4 niveaux (Public / Interne / Confidentiel / Restreint) avec cloisonnement au sein du dossier salarie (identite vs remuneration vs sanctions vs sante) et controle des exports par niveau.</w:t>
+        <w:t>Decrire le modele de droits : RBAC (roles) + perimetre (entite/agence) + relation manageriale (N+1/N+2) + regles exceptionnelles (interim, delegation). La classification native a 4 niveaux (Public / Interne / Confidentiel / Restreint) est LIVREE : regles d'acces, d'export, de chiffrement et d'audit configurables par niveau, 16 categories de donnees RH pre-classees (identite, remuneration, sanctions, sante...), endpoint de verification audite. Reste a finaliser le role Administrateur Systeme (acces technique avec masquage des salaires) pour completer les 6 profils du DAO.</w:t>
       </w:r>
     </w:p>
     <w:p>
@@ -3182,7 +3182,7 @@
           <w:color w:val="1A1A1A"/>
           <w:sz w:val="21"/>
         </w:rPr>
-        <w:t>SSO SAML/OIDC + Active Directory/Azure AD (a integrer), MFA, politique mdp, verrouillage, comptes inactifs ;</w:t>
+        <w:t>SSO SAML/OIDC + Active Directory/LDAP configurables par tenant (livre : domaines geres, mapping groupes-&gt;role, JIT, test de decouverte OIDC ; login federe a brancher), MFA, politique mdp, verrouillage, comptes inactifs ;</w:t>
       </w:r>
     </w:p>
     <w:p>
@@ -3208,7 +3208,7 @@
           <w:color w:val="1A1A1A"/>
           <w:sz w:val="21"/>
         </w:rPr>
-        <w:t>TLS en transit ; AES-256-GCM au repos ; gestion et rotation des cles (KMS) a formaliser ; sauvegardes chiffrees ;</w:t>
+        <w:t>TLS en transit ; AES-256-GCM au repos (NNI/IBAN, secrets SSO/SIEM) ; gestion et rotation des cles (KMS) a formaliser ; sauvegardes chiffrees ;</w:t>
       </w:r>
     </w:p>
     <w:p>
@@ -3234,7 +3234,7 @@
           <w:color w:val="1A1A1A"/>
           <w:sz w:val="21"/>
         </w:rPr>
-        <w:t>contenu minimal des logs, protection et duree de conservation ; export syslog/API vers le SIEM de la banque (a developper) ;</w:t>
+        <w:t>contenu minimal des logs, protection et duree de conservation ; export SIEM livre (webhook signe HMAC-SHA256, format JSON ou CEF/ArcSight, filtrage par categorie) ;</w:t>
       </w:r>
     </w:p>
     <w:p>
@@ -3342,7 +3342,7 @@
           <w:color w:val="1A1A1A"/>
           <w:sz w:val="21"/>
         </w:rPr>
-        <w:t>Rappel : l'interface SAGE n'est requise que si VERSUS BANK choisit de conserver SAGE comme moteur de paie (Option B, cf. ch. 2.4). En Option A (paie native NexusRH), ce chapitre est sans objet. Si Option B : decrire l'architecture du connecteur : flux SIRH-&gt;SAGE (donnees contractuelles, individuelles, variables de paie), flux SAGE-&gt;SIRH (bulletins PDF, journaux, statut de traitement). Preciser le mode d'echange (API REST, fichiers CSV/Excel, SFTP, connecteur natif), la frequence (batch/temps reel), la gestion des rejets et la reprise, ainsi que la separation des taches (SoD).</w:t>
+        <w:t>Rappel : l'interface SAGE n'est requise que si VERSUS BANK choisit de conserver SAGE comme moteur de paie (Option B, cf. ch. 2.4). En Option A (paie native NexusRH), ce chapitre est sans objet. Si Option B : le flux SIRH-&gt;SAGE est LIVRE - export des employes, elements variables (par periode) et resultats de paie au format delimite parametrable (separateur ; / , / tab / |, ligne d'en-tete, source du matricule), encodage UTF-8 BOM pour ouverture directe dans SAGE/Excel, neutralisation des injections de formules CSV, montants FCFA entiers, chaque export audite. Reste a parametrer selon l'instance SAGE de la banque : le flux retour SAGE-&gt;SIRH (bulletins PDF, journaux, statut), le mode d'echange (fichiers/SFTP ou API), la frequence, la gestion des rejets et la separation des taches (SoD).</w:t>
       </w:r>
     </w:p>
     <w:p>
@@ -3373,7 +3373,7 @@
           <w:color w:val="1A1A1A"/>
           <w:sz w:val="21"/>
         </w:rPr>
-        <w:t>Integration AD/Azure AD : SSO, provisioning, synchronisation des attributs, cycle de vie des comptes.</w:t>
+        <w:t>Integration AD/Azure AD/LDAP : la configuration SSO par tenant est livree (OIDC/SAML/LDAP, domaines e-mail geres, mapping des groupes IdP vers les roles NexusRH, provisionnement a la volee JIT, test de decouverte OpenID Connect). Reste a brancher le flux de login federe sur le pipeline d'authentification et la synchronisation/cycle de vie des comptes.</w:t>
       </w:r>
     </w:p>
     <w:p>

</xml_diff>